<commit_message>
feat(bar-business-plan): entregables EN regenerados tras la revisión final (mismas cifras del caso)
aplicar_en --idempotencia + ensamblar_docx en el VPS con los arreglos de texto de 5be311da: gates G1-G9 TODO VERDE,
--autotest 20/20 y 8/8, 0 fallos de pycel, 0 diferencias, barrido sin cifras ES ni español ni no latinos. Los 100
tokens de cifras_caso.json idénticos a los de antes; 5 tokens derivados nuevos. F2-NOTAS §9.

Via: Claude Code
Co-Authored-By: Claude Opus 5.5 <noreply@anthropic.com>
Claude-Session: https://claude.ai/code/session_01KriAdpMP6uaswtiVvqtBvP
</commit_message>
<xml_diff>
--- a/astro-site/public/dl/bar-business-plan/bar-business-plan.docx
+++ b/astro-site/public/dl/bar-business-plan/bar-business-plan.docx
@@ -315,7 +315,7 @@
     </w:p>
     <w:p>
       <w:r>
-        <w:t>The American bar scene is shifting toward smaller, more focused neighborhood venues, and that shift favors a concept like ours: a neighborhood bar with small plates (tapas-style), built around cocktails, draft beer and wine, with a short kitchen menu designed for sharing. Three trends support it. Guests want a reliable local spot close to home or work rather than a destination night out. Happy hour has become a daily ritual for after-work crowds and neighborhood regulars. And diners increasingly expect real food at a bar, so a menu of well-made shareable plates keeps guests longer and lifts the check. Each of these trends is a bet on repeat visits, and repeat visits are what this plan is built to earn.</w:t>
+        <w:t>Many neighborhoods are seeing demand for smaller, more focused local venues, and that favors a concept like ours: a neighborhood bar with small plates (tapas-style), built around cocktails, draft beer and wine, with a short kitchen menu designed for sharing. Three trends support it. Guests want a reliable local spot close to home or work rather than a destination night out. Happy hour has become a daily ritual for after-work crowds and neighborhood regulars. And diners increasingly expect real food at a bar, so a menu of well-made shareable plates keeps guests longer and lifts the check. Each of these trends is a bet on repeat visits, and repeat visits are what this plan is built to earn.</w:t>
       </w:r>
     </w:p>
     <w:p>
@@ -330,7 +330,7 @@
     </w:p>
     <w:p>
       <w:r>
-        <w:t>Year-1 revenue is projected at $923,400 excluding sales tax. That comes from 95 covers (guests) a day at an average check of $27.00, over 360 days a year, which works out to about 1.6 seat turns a day across 60 seats. Cost of goods runs at 24.8% of sales for a gross margin of 69.7%, and year-1 EBITDA is 18.6% of revenue. Accounting break-even sits at 81 covers a day. Cash break-even, with loan payments in and depreciation out, sits at 79 covers a day, so the projected volume leaves a 21% margin of safety over it. Year-1 net profit is $75,358, and the DSCR in year 1 is 2.44×.</w:t>
+        <w:t>Year-1 revenue is projected at $923,400 excluding sales tax. That comes from 95 covers (guests) a day at an average check of $27.00, over 360 days a year, which works out to about 1.6 seat turns a day across 60 seats. Cost of goods runs at 24.8% of sales; after card fees, disposables and the contingency line (5.5% more), the gross margin is 69.7%, and year-1 EBITDA is 18.6% of revenue. Accounting break-even sits at 81 covers a day. Cash break-even, with loan payments in and depreciation out, sits at 79 covers a day, so the projected volume leaves a 21% margin of safety over it. Year-1 net profit is $75,358 (after a 25% C corporation tax example; pass-through owners set it to 0 and pay tax personally), and the DSCR in year 1 is 2.44×.</w:t>
       </w:r>
     </w:p>
     <w:p>
@@ -424,12 +424,12 @@
     </w:p>
     <w:p>
       <w:r>
-        <w:t>Happy hour is one of the most useful tools a neighborhood bar has. It fills the early-evening hours that would otherwise be empty, builds a habit among local workers and turns a first visit into a regular one. The key is to design it as a business decision: choose the days and hours based on your neighborhood, keep discounts focused on drinks and plates with healthy margins, and avoid training guests to arrive only when prices drop. In the workbook, the "Scenarios" tab lets you test what happens to revenue and break-even when volume per day moves up or down, so you can see how much a busier early evening is worth before you commit to a program.</w:t>
+        <w:t>Happy hour is one of the most useful tools a neighborhood bar has. It fills the early-evening hours that would otherwise be empty, builds a habit among local workers and turns a first visit into a regular one. The key is to design it as a business decision: choose the days and hours based on your neighborhood, keep discounts focused on drinks and plates with healthy margins, and avoid training guests to arrive only when prices drop. In the workbook, the "Scenarios" tab lets you test what happens to revenue and break-even when volume per day moves up or down, so you can see how much a busier early evening is worth before you commit to a program. Check your state's rules first: some states, including Massachusetts and Utah, ban discounted drink specials, and many limit free drinks in loyalty programs; there, build the early evening around food specials and events.</w:t>
       </w:r>
     </w:p>
     <w:p>
       <w:r>
-        <w:t>Competition in this segment is real, but there is room for a well-defined concept. Many neighborhood bars never update their menu, their drinks or their guest experience, and that gap is the opportunity for an owner who executes a clear idea: a balanced list of classic and original cocktails, a considered wine and draft selection and a room that feels both familiar and current. Entry is not cheap, though. Restaurant365 puts opening a bar at $100,000 to $850,000 or more, and the RestaurantOwner.com survey reports a $110,000 to $550,000 range for a leased space, with a recommended operating reserve of $75,000 to $100,000. The example in this plan, with a payback of 2.5 years, sits inside that range. Your payback will depend on your lease, build-out and volume, so run your numbers in the workbook before you commit.</w:t>
+        <w:t>Competition in this segment is real, but there is room for a well-defined concept. Many neighborhood bars never update their menu, their drinks or their guest experience, and that gap is the opportunity for an owner who executes a clear idea: a balanced list of classic and original cocktails, a considered wine and draft selection and a room that feels both familiar and current. Entry is not cheap, though. Restaurant365 puts opening a bar at $100,000 to $850,000 or more, and the RestaurantOwner.com survey reports a $110,000 to $550,000 range for a leased space, with a recommended operating reserve of $75,000 to $100,000. The example in this plan, with $361,700 of startup costs, sits inside that range, and the workbook puts its payback before debt at 2.5 years. Your payback will depend on your lease, build-out and volume, so run your numbers in the workbook before you commit.</w:t>
       </w:r>
     </w:p>
     <w:p>
@@ -528,7 +528,7 @@
     </w:p>
     <w:p>
       <w:r>
-        <w:t>The loyalty program should follow business logic, not just promotion. A points system redeemable for drinks, plates or special experiences, tied to an app or a simple card, lets you capture guest data for direct marketing, such as an email list or text updates. The goal is to build a base of frequent guests who account for a meaningful share of sales and who spend more than occasional visitors because of familiarity and trust. A daily specials board for small plates works as a differentiator, signals freshness and gives the kitchen flexible margins on items that turn quickly. Keep the program simple enough that your team can explain it in one sentence.</w:t>
+        <w:t>The loyalty program should follow business logic, not just promotion. A points system redeemable for plates, merchandise or special experiences (free drinks are restricted in some states), tied to an app or a simple card, lets you capture guest data for direct marketing, such as an email list or text updates. The goal is to build a base of frequent guests who account for a meaningful share of sales and who spend more than occasional visitors because of familiarity and trust. A daily specials board for small plates works as a differentiator, signals freshness and gives the kitchen flexible margins on items that turn quickly. Keep the program simple enough that your team can explain it in one sentence.</w:t>
       </w:r>
     </w:p>
     <w:p>
@@ -565,7 +565,7 @@
     </w:p>
     <w:p>
       <w:r>
-        <w:t>The kitchen is deliberately short, and it should be sized for efficient small-plates production, not for a full restaurant menu. The core equipment is a gas griddle, a fryer with a filtration system and a combi or standard oven, all under a Type I hood with a fire suppression system and served by a grease interceptor, which is why the plumbing and hood line in the budget is significant. Behind the bar, the build includes underbar stations for speed, back-bar coolers for beer, mixers and garnish, and a draft beer system with enough lines for a rotating tap list. The distributor usually installs and services the lines and the glycol cooling, which saves you a specialist hire. Furniture is a mix of tables, high-tops and bar stools, plus patio seating when the lease allows it.</w:t>
+        <w:t>The kitchen is deliberately short, and it should be sized for efficient small-plates production, not for a full restaurant menu. The core equipment is a gas griddle, a fryer with a filtration system and a combi or standard oven, all under a Type I hood with a fire suppression system and served by a grease interceptor, which is why the plumbing and hood line in the budget is significant. Behind the bar, the build includes underbar stations for speed, back-bar coolers for beer, mixers and garnish, and a draft beer system with enough lines for a rotating tap list. A draft installer, sometimes arranged through your distributor, installs the lines and the glycol cooling; budget it yourself and plan regular line cleaning. Furniture is a mix of tables, high-tops and bar stools, plus patio seating when the lease allows it.</w:t>
       </w:r>
     </w:p>
     <w:p>
@@ -632,7 +632,7 @@
     </w:p>
     <w:p>
       <w:r>
-        <w:t>Training is a real advantage in a market where guests notice consistency. The program should cover draft beer service and line cleaning, cocktail specs and pour control, small-plates timing and presentation, and food safety, with special attention to the nine major allergens, which US food law requires you to be able to identify and communicate to guests. Responsible alcohol service training such as TIPS or ServSafe Alcohol should be on the list for every bartender, server and manager. Finally, teach servers to suggest pairings and shareable plates, because a thoughtful recommendation lifts the check without any pressure on the guest.</w:t>
+        <w:t>Training is a real advantage in a market where guests notice consistency. The program should cover draft beer service and line cleaning, cocktail specs and pour control, small-plates timing and presentation, and food safety, with special attention to the nine major allergens, which the FDA Food Code, as adopted by your state, requires you to be able to identify and communicate to guests. Responsible alcohol service training such as TIPS or ServSafe Alcohol should be on the list for every bartender, server and manager. Finally, teach servers to suggest pairings and shareable plates, because a thoughtful recommendation lifts the check without any pressure on the guest.</w:t>
       </w:r>
     </w:p>
     <w:p>
@@ -669,7 +669,7 @@
     </w:p>
     <w:p>
       <w:r>
-        <w:t>The cost structure is a bar's, not a restaurant's. Food cost is modeled at 30% of food sales and beverage cost at 22% of beverage sales, which gives cost of goods of 24.8% of total sales and a gross margin of 69.7%. Labor is 33.4% of sales and occupancy is 8.4%. Prime cost, meaning cost of goods plus labor, comes out at 58.2% in year 1. That is below the 60% to 65% that Restaurant365 cites for full-service restaurants, and the reason is simple: a bar sells mostly drinks, and drinks cost far less to make than a plate of food. Tips are not in this number, since the base wages already cover the team. Consumables, card fees and a contingency line are budgeted separately, so the workbook gives you the whole picture. If your pour cost drifts upward, prime cost is the first number that moves, which is why we track it weekly.</w:t>
+        <w:t>The cost structure is a bar's, not a restaurant's. Food cost is modeled at 30% of food sales and beverage cost at 22% of beverage sales, which gives cost of goods of 24.8% of total sales; with card fees, disposables and contingency the variable costs reach 30.3%, for a gross margin of 69.7%. Labor is 33.4% of sales and occupancy is 8.4%. Prime cost, meaning cost of goods plus labor, comes out at 58.2% in year 1. That is below the 60% to 65% that Restaurant365 cites for full-service restaurants, and the reason is simple: a bar sells mostly drinks, and drinks cost far less to make than a plate of food. Tips are not in this number, since the base wages already cover the team, and employer FICA on reported tips is not modeled either (largely offset by the FICA tip credit; ask your CPA). Card fees, disposables and contingency are variable costs counted before the gross margin, so the workbook gives you the whole picture. If your pour cost drifts upward, prime cost is the first number that moves, which is why we track it weekly.</w:t>
       </w:r>
     </w:p>
     <w:p>
@@ -679,7 +679,7 @@
     </w:p>
     <w:p>
       <w:r>
-        <w:t>The "Scenarios" tab tests three situations. The pessimistic case assumes 71 covers a day at an average check of $25.00 over 340 days, for revenue of $603,500, a pre-tax result of -$122,493 and an estimated year-1 closing cash position of $15,791. The base case is the one described above. The optimistic case reaches 119 covers a day at $29.00 over 360 days, with revenue of $1,242,360 and a pre-tax result of $322,792. In the base case the project returns its investment before debt in a payback of 2.5 years. Read the pessimistic case as a stress test: if cash runs out there, you need a bigger reserve or a smaller opening.</w:t>
+        <w:t>The "Scenarios" tab tests three situations. The pessimistic case assumes 71 covers a day at an average check of $25.00 over 340 days, for revenue of $603,500 and a pre-tax loss of $122,493. Operations lose money even before depreciation and interest (about $51,388), so the loan payment comes out of the working capital reserve: the bar ends year 1 with an estimated $15,791 of cash, and a second year like that would run out of cash. The base case is the one described above. The optimistic case reaches 119 covers a day at $29.00 over 360 days, with revenue of $1,242,360 and a pre-tax result of $322,792. In the base case the project returns its investment before debt in a payback of 2.5 years. Read the pessimistic case as a stress test: if it is plausible in your market, you need a bigger reserve, a smaller loan or a smaller opening.</w:t>
       </w:r>
     </w:p>
     <w:p>
@@ -706,12 +706,12 @@
     </w:p>
     <w:p>
       <w:r>
-        <w:t>Opening a bar in the United States means working through several layers of government, and the order matters. At the federal level you form your entity, usually an LLC, and get an Employer Identification Number from the IRS at no cost. At the state level you register for a seller's permit or sales tax account, and your alcohol license comes from a state agency. At the county and city level you need a business license, zoning approval and building permits for the build-out. Check zoning before you sign a lease, because the wrong zone can block a bar entirely. After the build-out, the city issues a certificate of occupancy, which you need before you open the doors.</w:t>
+        <w:t>Opening a bar in the United States means working through several layers of government, and the order matters. You form your entity, usually an LLC, with your state's Secretary of State, and at the federal level you get an Employer Identification Number from the IRS at no cost. Also at the state level you register for a seller's permit or sales tax account, and your alcohol license comes from a state agency. At the county and city level you need a business license, zoning approval and building permits for the build-out. Check zoning before you sign a lease, because the wrong zone can block a bar entirely. After the build-out, the city issues a certificate of occupancy, which you need before you open the doors.</w:t>
       </w:r>
     </w:p>
     <w:p>
       <w:r>
-        <w:t>The liquor license is the critical path. It is issued by a state agency, often called the ABC or the liquor control board, and it usually needs local approval as well. Classes vary by state, but the main choice is between a beer and wine license, which starts at about $3,000, and a full liquor license, which Poster's survey puts at $12,000 to $400,000. In states with a quota, you generally buy or transfer an existing license at market price, and that can be an order of magnitude more: R Street reports that bar licenses in Boston sell for north of $450,000. The workbook budgets $15,000 for a state without a quota as an example only, so replace it with your state's real fees. Start right after signing the lease, because it often takes 3 to 12 months. A license bought from another owner is generally an intangible asset, so ask your CPA how to treat it.</w:t>
+        <w:t>The liquor license is the critical path. It is issued by a state agency, often called the ABC or the liquor control board, and it usually needs local approval as well. Classes vary by state, but the main choice is between a beer and wine license, which starts at about $3,000, and a full liquor license, which Poster puts at $12,000 to $400,000. In states with a quota, you generally buy or transfer an existing license at market price, and that can be an order of magnitude more: R Street reports that bar licenses in Boston sell for north of $450,000. The workbook budgets $15,000 for a state without a quota as an example only, so replace it with your state's real fees. Start right after signing the lease, because it often takes 3 to 12 months. A license bought from another owner is generally an intangible asset, so ask your CPA how to treat it.</w:t>
       </w:r>
     </w:p>
     <w:p>
@@ -753,7 +753,7 @@
     </w:p>
     <w:p>
       <w:r>
-        <w:t>The risks are manageable but need active attention. Location is the biggest one, and the neighborhood you choose will drive results more than any other decision, so favor blocks with steady foot traffic near offices, residential density or entertainment. Competition in the bar category is real, which calls for a clear difference in product, atmosphere or service. The liquor license is a timing risk: if it takes longer than planned, you are paying rent on a closed bar, so start it early and keep a rent reserve. Over-pouring and waste can quietly erode margin, and seasonality matters on the patio and in tourist or college markets. We do not cite a national failure rate for bars, because we did not find a reliable source, but plan as if the first year will test every assumption.</w:t>
+        <w:t>The risks are manageable but need active attention. Location is the biggest one, and the neighborhood you choose will drive results more than any other decision, so favor blocks with steady foot traffic near offices, residential density or entertainment. Competition in the bar category is real, which calls for a clear difference in product, atmosphere or service. The liquor license is a timing risk: if it takes longer than planned, you are paying rent on a closed bar, so start it early, negotiate a license contingency in the lease and, if you expect it to take longer than the 2 months of pre-opening rent the workbook budgets, raise that number on "0. Assumptions". Over-pouring and waste can quietly erode margin, and seasonality matters on the patio and in tourist or college markets. We do not cite a national failure rate for bars, because we did not find a reliable source, but plan as if the first year will test every assumption.</w:t>
       </w:r>
     </w:p>
     <w:p>
@@ -763,7 +763,7 @@
     </w:p>
     <w:p>
       <w:r>
-        <w:t>The roadmap is realistic if you keep to the order of the checklist. In the first months, form the LLC, get the EIN, search for the location and negotiate the lease. Right after signing, start the liquor license application, since it is the longest item and may take 3 to 12 months, and apply for building permits and health department plan review in parallel. The next phase is the build-out and equipment, the stage where cost overruns hide in every hospitality project, so keep the contingency. After that, hire and train the team, including responsible alcohol service training, and set up the POS, the inventory counts and your supplier accounts. Plan at least four weeks of pre-opening for menu tests, process adjustments and launch marketing before the doors open.</w:t>
+        <w:t>The roadmap is realistic if you keep to the order of the checklist. In the first months, form the LLC, get the EIN, search for the location and negotiate the lease. Right after signing, start the liquor license application, since it is the longest item and may take 3 to 12 months, and apply for building permits and health department plan review in parallel. The next phase is the build-out and equipment, the stage where cost overruns hide in every hospitality project, so keep the contingency. After that, hire and train the team, including responsible alcohol service training, and set up the POS, the inventory counts and your supplier accounts. Plan at least four weeks of pre-opening for menu tests, process adjustments and launch marketing before the doors open; pre-opening payroll and training come out of the working capital reserve.</w:t>
       </w:r>
     </w:p>
     <w:p>
@@ -773,7 +773,7 @@
     </w:p>
     <w:p>
       <w:r>
-        <w:t>The three-year vision positions the bar as a local landmark, with loyal regulars, enough cash generation to reinvest in improvements and the potential to repeat the model if the results justify it. Year-3 revenue in the example is $1,168,101, and net profit is $197,922. These are projections from an example case, not promises, and your own numbers will differ. Use the workbook to test your concept, bring the plan to your lender and your partners, and update it as the real figures come in.</w:t>
+        <w:t>The three-year vision positions the bar as a local landmark, with loyal regulars, enough cash generation to reinvest in improvements and the potential to repeat the model if the results justify it. Year-3 revenue in the example is $1,168,101, and net profit is $197,922 (after the 25% C corporation tax example; pass-through owners set it to 0 and pay tax personally). These are projections from an example case, not promises, and your own numbers will differ. Use the workbook to test your concept, bring the plan to your lender and your partners, and update it as the real figures come in.</w:t>
       </w:r>
     </w:p>
     <w:p>

</xml_diff>